<commit_message>
update to printable doc
</commit_message>
<xml_diff>
--- a/Arkime/PrintableArkimeFix.docx
+++ b/Arkime/PrintableArkimeFix.docx
@@ -1,6 +1,6 @@
 
 <file path=word/document.xml><?xml version="1.0" encoding="utf-8"?>
-<w:document xmlns:wpc="http://schemas.microsoft.com/office/word/2010/wordprocessingCanvas" xmlns:cx="http://schemas.microsoft.com/office/drawing/2014/chartex" xmlns:cx1="http://schemas.microsoft.com/office/drawing/2015/9/8/chartex" xmlns:mc="http://schemas.openxmlformats.org/markup-compatibility/2006" xmlns:o="urn:schemas-microsoft-com:office:office" xmlns:r="http://schemas.openxmlformats.org/officeDocument/2006/relationships" xmlns:m="http://schemas.openxmlformats.org/officeDocument/2006/math" xmlns:v="urn:schemas-microsoft-com:vml" xmlns:wp14="http://schemas.microsoft.com/office/word/2010/wordprocessingDrawing" xmlns:wp="http://schemas.openxmlformats.org/drawingml/2006/wordprocessingDrawing" xmlns:w10="urn:schemas-microsoft-com:office:word" xmlns:w="http://schemas.openxmlformats.org/wordprocessingml/2006/main" xmlns:w14="http://schemas.microsoft.com/office/word/2010/wordml" xmlns:w15="http://schemas.microsoft.com/office/word/2012/wordml" xmlns:w16se="http://schemas.microsoft.com/office/word/2015/wordml/symex" xmlns:wpg="http://schemas.microsoft.com/office/word/2010/wordprocessingGroup" xmlns:wpi="http://schemas.microsoft.com/office/word/2010/wordprocessingInk" xmlns:wne="http://schemas.microsoft.com/office/word/2006/wordml" xmlns:wps="http://schemas.microsoft.com/office/word/2010/wordprocessingShape" mc:Ignorable="w14 w15 w16se wp14">
+<w:document xmlns:wpc="http://schemas.microsoft.com/office/word/2010/wordprocessingCanvas" xmlns:cx="http://schemas.microsoft.com/office/drawing/2014/chartex" xmlns:cx1="http://schemas.microsoft.com/office/drawing/2015/9/8/chartex" xmlns:cx2="http://schemas.microsoft.com/office/drawing/2015/10/21/chartex" xmlns:cx3="http://schemas.microsoft.com/office/drawing/2016/5/9/chartex" xmlns:cx4="http://schemas.microsoft.com/office/drawing/2016/5/10/chartex" xmlns:cx5="http://schemas.microsoft.com/office/drawing/2016/5/11/chartex" xmlns:cx6="http://schemas.microsoft.com/office/drawing/2016/5/12/chartex" xmlns:cx7="http://schemas.microsoft.com/office/drawing/2016/5/13/chartex" xmlns:cx8="http://schemas.microsoft.com/office/drawing/2016/5/14/chartex" xmlns:mc="http://schemas.openxmlformats.org/markup-compatibility/2006" xmlns:aink="http://schemas.microsoft.com/office/drawing/2016/ink" xmlns:am3d="http://schemas.microsoft.com/office/drawing/2017/model3d" xmlns:o="urn:schemas-microsoft-com:office:office" xmlns:oel="http://schemas.microsoft.com/office/2019/extlst" xmlns:r="http://schemas.openxmlformats.org/officeDocument/2006/relationships" xmlns:m="http://schemas.openxmlformats.org/officeDocument/2006/math" xmlns:v="urn:schemas-microsoft-com:vml" xmlns:wp14="http://schemas.microsoft.com/office/word/2010/wordprocessingDrawing" xmlns:wp="http://schemas.openxmlformats.org/drawingml/2006/wordprocessingDrawing" xmlns:w10="urn:schemas-microsoft-com:office:word" xmlns:w="http://schemas.openxmlformats.org/wordprocessingml/2006/main" xmlns:w14="http://schemas.microsoft.com/office/word/2010/wordml" xmlns:w15="http://schemas.microsoft.com/office/word/2012/wordml" xmlns:w16cex="http://schemas.microsoft.com/office/word/2018/wordml/cex" xmlns:w16cid="http://schemas.microsoft.com/office/word/2016/wordml/cid" xmlns:w16="http://schemas.microsoft.com/office/word/2018/wordml" xmlns:w16du="http://schemas.microsoft.com/office/word/2023/wordml/word16du" xmlns:w16sdtdh="http://schemas.microsoft.com/office/word/2020/wordml/sdtdatahash" xmlns:w16sdtfl="http://schemas.microsoft.com/office/word/2024/wordml/sdtformatlock" xmlns:w16se="http://schemas.microsoft.com/office/word/2015/wordml/symex" xmlns:wpg="http://schemas.microsoft.com/office/word/2010/wordprocessingGroup" xmlns:wpi="http://schemas.microsoft.com/office/word/2010/wordprocessingInk" xmlns:wne="http://schemas.microsoft.com/office/word/2006/wordml" xmlns:wps="http://schemas.microsoft.com/office/word/2010/wordprocessingShape" mc:Ignorable="w14 w15 w16se w16cid w16 w16cex w16sdtdh w16sdtfl w16du wp14">
   <w:body>
     <w:p>
       <w:pPr>
@@ -66,27 +66,7 @@
           <w:sz w:val="20"/>
           <w:szCs w:val="21"/>
         </w:rPr>
-        <w:t xml:space="preserve"> is </w:t>
-      </w:r>
-      <w:proofErr w:type="gramStart"/>
-      <w:r>
-        <w:rPr>
-          <w:rFonts w:ascii="Segoe UI" w:eastAsia="Times New Roman" w:hAnsi="Segoe UI" w:cs="Segoe UI"/>
-          <w:color w:val="172B4D"/>
-          <w:sz w:val="20"/>
-          <w:szCs w:val="21"/>
-        </w:rPr>
-        <w:t>Reporting</w:t>
-      </w:r>
-      <w:proofErr w:type="gramEnd"/>
-      <w:r>
-        <w:rPr>
-          <w:rFonts w:ascii="Segoe UI" w:eastAsia="Times New Roman" w:hAnsi="Segoe UI" w:cs="Segoe UI"/>
-          <w:color w:val="172B4D"/>
-          <w:sz w:val="20"/>
-          <w:szCs w:val="21"/>
-        </w:rPr>
-        <w:t xml:space="preserve"> very high memory consumption and high Disk Write IO after running for a few days on a sensor. Memory problems in </w:t>
+        <w:t xml:space="preserve"> is Reporting very high memory consumption and high Disk Write IO after running for a few days on a sensor. Memory problems in </w:t>
       </w:r>
       <w:proofErr w:type="spellStart"/>
       <w:r>
@@ -117,31 +97,7 @@
           <w:sz w:val="20"/>
           <w:szCs w:val="21"/>
         </w:rPr>
-        <w:t xml:space="preserve">high traffic volume, inadequate JVM heap for metadata, </w:t>
-      </w:r>
-      <w:proofErr w:type="spellStart"/>
-      <w:r>
-        <w:rPr>
-          <w:rFonts w:ascii="Segoe UI" w:eastAsia="Times New Roman" w:hAnsi="Segoe UI" w:cs="Segoe UI"/>
-          <w:b/>
-          <w:bCs/>
-          <w:color w:val="172B4D"/>
-          <w:sz w:val="20"/>
-          <w:szCs w:val="21"/>
-        </w:rPr>
-        <w:t>Lua</w:t>
-      </w:r>
-      <w:proofErr w:type="spellEnd"/>
-      <w:r>
-        <w:rPr>
-          <w:rFonts w:ascii="Segoe UI" w:eastAsia="Times New Roman" w:hAnsi="Segoe UI" w:cs="Segoe UI"/>
-          <w:b/>
-          <w:bCs/>
-          <w:color w:val="172B4D"/>
-          <w:sz w:val="20"/>
-          <w:szCs w:val="21"/>
-        </w:rPr>
-        <w:t xml:space="preserve"> plugin leaks</w:t>
+        <w:t>high traffic volume, inadequate JVM heap for metadata, Lua plugin leaks</w:t>
       </w:r>
       <w:r>
         <w:rPr>
@@ -191,27 +147,7 @@
           <w:sz w:val="20"/>
           <w:szCs w:val="21"/>
         </w:rPr>
-        <w:t xml:space="preserve">, use separate machines for capture and </w:t>
-      </w:r>
-      <w:proofErr w:type="spellStart"/>
-      <w:r>
-        <w:rPr>
-          <w:rFonts w:ascii="Segoe UI" w:eastAsia="Times New Roman" w:hAnsi="Segoe UI" w:cs="Segoe UI"/>
-          <w:color w:val="172B4D"/>
-          <w:sz w:val="20"/>
-          <w:szCs w:val="21"/>
-        </w:rPr>
-        <w:t>Elasticsearch</w:t>
-      </w:r>
-      <w:proofErr w:type="spellEnd"/>
-      <w:r>
-        <w:rPr>
-          <w:rFonts w:ascii="Segoe UI" w:eastAsia="Times New Roman" w:hAnsi="Segoe UI" w:cs="Segoe UI"/>
-          <w:color w:val="172B4D"/>
-          <w:sz w:val="20"/>
-          <w:szCs w:val="21"/>
-        </w:rPr>
-        <w:t xml:space="preserve"> where possible (i.e. </w:t>
+        <w:t>, use separate machines for capture and Elasticsearch where possible (i.e. </w:t>
       </w:r>
       <w:r>
         <w:rPr>
@@ -231,47 +167,7 @@
           <w:sz w:val="20"/>
           <w:szCs w:val="21"/>
         </w:rPr>
-        <w:t xml:space="preserve">deploy on </w:t>
-      </w:r>
-      <w:proofErr w:type="spellStart"/>
-      <w:r>
-        <w:rPr>
-          <w:rFonts w:ascii="Segoe UI" w:eastAsia="Times New Roman" w:hAnsi="Segoe UI" w:cs="Segoe UI"/>
-          <w:color w:val="172B4D"/>
-          <w:sz w:val="20"/>
-          <w:szCs w:val="21"/>
-        </w:rPr>
-        <w:t>Elasticsearch</w:t>
-      </w:r>
-      <w:proofErr w:type="spellEnd"/>
-      <w:r>
-        <w:rPr>
-          <w:rFonts w:ascii="Segoe UI" w:eastAsia="Times New Roman" w:hAnsi="Segoe UI" w:cs="Segoe UI"/>
-          <w:color w:val="172B4D"/>
-          <w:sz w:val="20"/>
-          <w:szCs w:val="21"/>
-        </w:rPr>
-        <w:t xml:space="preserve"> pods), and ensure regular housekeeping of session indexes (conduct regular snapshots of indices in </w:t>
-      </w:r>
-      <w:proofErr w:type="spellStart"/>
-      <w:r>
-        <w:rPr>
-          <w:rFonts w:ascii="Segoe UI" w:eastAsia="Times New Roman" w:hAnsi="Segoe UI" w:cs="Segoe UI"/>
-          <w:color w:val="172B4D"/>
-          <w:sz w:val="20"/>
-          <w:szCs w:val="21"/>
-        </w:rPr>
-        <w:t>Elasticsearch</w:t>
-      </w:r>
-      <w:proofErr w:type="spellEnd"/>
-      <w:r>
-        <w:rPr>
-          <w:rFonts w:ascii="Segoe UI" w:eastAsia="Times New Roman" w:hAnsi="Segoe UI" w:cs="Segoe UI"/>
-          <w:color w:val="172B4D"/>
-          <w:sz w:val="20"/>
-          <w:szCs w:val="21"/>
-        </w:rPr>
-        <w:t>).</w:t>
+        <w:t>deploy on Elasticsearch pods), and ensure regular housekeeping of session indexes (conduct regular snapshots of indices in Elasticsearch).</w:t>
       </w:r>
     </w:p>
     <w:p>
@@ -363,27 +259,7 @@
           <w:sz w:val="20"/>
           <w:szCs w:val="21"/>
         </w:rPr>
-        <w:t xml:space="preserve"> service to the sensor in question with the variables and values listed below in the deploy/re-deploy </w:t>
-      </w:r>
-      <w:proofErr w:type="spellStart"/>
-      <w:r>
-        <w:rPr>
-          <w:rFonts w:ascii="Segoe UI" w:eastAsia="Times New Roman" w:hAnsi="Segoe UI" w:cs="Segoe UI"/>
-          <w:color w:val="172B4D"/>
-          <w:sz w:val="20"/>
-          <w:szCs w:val="21"/>
-        </w:rPr>
-        <w:t>configs</w:t>
-      </w:r>
-      <w:proofErr w:type="spellEnd"/>
-      <w:r>
-        <w:rPr>
-          <w:rFonts w:ascii="Segoe UI" w:eastAsia="Times New Roman" w:hAnsi="Segoe UI" w:cs="Segoe UI"/>
-          <w:color w:val="172B4D"/>
-          <w:sz w:val="20"/>
-          <w:szCs w:val="21"/>
-        </w:rPr>
-        <w:t xml:space="preserve">. </w:t>
+        <w:t xml:space="preserve"> service to the sensor in question with the variables and values listed below in the deploy/re-deploy configs. </w:t>
       </w:r>
       <w:proofErr w:type="gramStart"/>
       <w:r>
@@ -423,7 +299,27 @@
           <w:sz w:val="20"/>
           <w:szCs w:val="21"/>
         </w:rPr>
-        <w:t xml:space="preserve"> is deployed with these settings you should have a very lightweight, fast baseline that will process small segments really fast and not get bogged down with processing large blocks or chunks of data. </w:t>
+        <w:t xml:space="preserve"> is deployed with these settings you should have a very lightweight, fast baseline that will process small segments </w:t>
+      </w:r>
+      <w:proofErr w:type="gramStart"/>
+      <w:r>
+        <w:rPr>
+          <w:rFonts w:ascii="Segoe UI" w:eastAsia="Times New Roman" w:hAnsi="Segoe UI" w:cs="Segoe UI"/>
+          <w:color w:val="172B4D"/>
+          <w:sz w:val="20"/>
+          <w:szCs w:val="21"/>
+        </w:rPr>
+        <w:t>really fast</w:t>
+      </w:r>
+      <w:proofErr w:type="gramEnd"/>
+      <w:r>
+        <w:rPr>
+          <w:rFonts w:ascii="Segoe UI" w:eastAsia="Times New Roman" w:hAnsi="Segoe UI" w:cs="Segoe UI"/>
+          <w:color w:val="172B4D"/>
+          <w:sz w:val="20"/>
+          <w:szCs w:val="21"/>
+        </w:rPr>
+        <w:t xml:space="preserve"> and not get bogged down with processing large blocks or chunks of data. </w:t>
       </w:r>
       <w:proofErr w:type="gramStart"/>
       <w:r>
@@ -583,21 +479,8 @@
                 <w:sz w:val="20"/>
                 <w:szCs w:val="24"/>
               </w:rPr>
-              <w:t xml:space="preserve"> re-deploy </w:t>
-            </w:r>
-            <w:proofErr w:type="spellStart"/>
-            <w:r>
-              <w:rPr>
-                <w:rFonts w:ascii="Times New Roman" w:eastAsia="Times New Roman" w:hAnsi="Times New Roman" w:cs="Times New Roman"/>
-                <w:b/>
-                <w:bCs/>
-                <w:color w:val="172B4D"/>
-                <w:sz w:val="20"/>
-                <w:szCs w:val="24"/>
-              </w:rPr>
-              <w:t>configs</w:t>
-            </w:r>
-            <w:proofErr w:type="spellEnd"/>
+              <w:t xml:space="preserve"> re-deploy configs</w:t>
+            </w:r>
           </w:p>
         </w:tc>
       </w:tr>
@@ -641,8 +524,6 @@
               </w:rPr>
               <w:t>Variable</w:t>
             </w:r>
-            <w:bookmarkStart w:id="0" w:name="_GoBack"/>
-            <w:bookmarkEnd w:id="0"/>
           </w:p>
         </w:tc>
         <w:tc>
@@ -1704,25 +1585,7 @@
                 <w:sz w:val="20"/>
                 <w:szCs w:val="24"/>
               </w:rPr>
-              <w:t xml:space="preserve">Limits how many </w:t>
-            </w:r>
-            <w:proofErr w:type="spellStart"/>
-            <w:r>
-              <w:rPr>
-                <w:rFonts w:ascii="Times New Roman" w:eastAsia="Times New Roman" w:hAnsi="Times New Roman" w:cs="Times New Roman"/>
-                <w:sz w:val="20"/>
-                <w:szCs w:val="24"/>
-              </w:rPr>
-              <w:t>Elasticsearch</w:t>
-            </w:r>
-            <w:proofErr w:type="spellEnd"/>
-            <w:r>
-              <w:rPr>
-                <w:rFonts w:ascii="Times New Roman" w:eastAsia="Times New Roman" w:hAnsi="Times New Roman" w:cs="Times New Roman"/>
-                <w:sz w:val="20"/>
-                <w:szCs w:val="24"/>
-              </w:rPr>
-              <w:t xml:space="preserve"> indices </w:t>
+              <w:t xml:space="preserve">Limits how many Elasticsearch indices </w:t>
             </w:r>
             <w:proofErr w:type="spellStart"/>
             <w:r>
@@ -2349,156 +2212,164 @@
                 <w:sz w:val="20"/>
                 <w:szCs w:val="24"/>
               </w:rPr>
+              <w:t>"</w:t>
+            </w:r>
+            <w:proofErr w:type="spellStart"/>
+            <w:r>
+              <w:rPr>
+                <w:rFonts w:ascii="Times New Roman" w:eastAsia="Times New Roman" w:hAnsi="Times New Roman" w:cs="Times New Roman"/>
+                <w:b/>
+                <w:bCs/>
+                <w:sz w:val="20"/>
+                <w:szCs w:val="24"/>
+              </w:rPr>
+              <w:t>dbBulkSize</w:t>
+            </w:r>
+            <w:proofErr w:type="spellEnd"/>
+            <w:r>
+              <w:rPr>
+                <w:rFonts w:ascii="Times New Roman" w:eastAsia="Times New Roman" w:hAnsi="Times New Roman" w:cs="Times New Roman"/>
+                <w:b/>
+                <w:bCs/>
+                <w:sz w:val="20"/>
+                <w:szCs w:val="24"/>
+              </w:rPr>
+              <w:t>"</w:t>
+            </w:r>
+          </w:p>
+        </w:tc>
+        <w:tc>
+          <w:tcPr>
+            <w:tcW w:w="1260" w:type="dxa"/>
+            <w:tcBorders>
+              <w:top w:val="single" w:sz="6" w:space="0" w:color="auto"/>
+              <w:left w:val="single" w:sz="6" w:space="0" w:color="auto"/>
+              <w:bottom w:val="single" w:sz="6" w:space="0" w:color="auto"/>
+              <w:right w:val="single" w:sz="6" w:space="0" w:color="auto"/>
+            </w:tcBorders>
+            <w:tcMar>
+              <w:top w:w="105" w:type="dxa"/>
+              <w:left w:w="150" w:type="dxa"/>
+              <w:bottom w:w="105" w:type="dxa"/>
+              <w:right w:w="150" w:type="dxa"/>
+            </w:tcMar>
+            <w:hideMark/>
+          </w:tcPr>
+          <w:p>
+            <w:pPr>
+              <w:spacing w:after="0" w:line="240" w:lineRule="auto"/>
+              <w:rPr>
+                <w:rFonts w:ascii="Times New Roman" w:eastAsia="Times New Roman" w:hAnsi="Times New Roman" w:cs="Times New Roman"/>
+                <w:sz w:val="20"/>
+                <w:szCs w:val="24"/>
+              </w:rPr>
+            </w:pPr>
+            <w:r>
+              <w:rPr>
+                <w:rFonts w:ascii="Times New Roman" w:eastAsia="Times New Roman" w:hAnsi="Times New Roman" w:cs="Times New Roman"/>
+                <w:sz w:val="20"/>
+                <w:szCs w:val="24"/>
+              </w:rPr>
+              <w:t>“150000”</w:t>
+            </w:r>
+          </w:p>
+        </w:tc>
+        <w:tc>
+          <w:tcPr>
+            <w:tcW w:w="1620" w:type="dxa"/>
+            <w:tcBorders>
+              <w:top w:val="single" w:sz="6" w:space="0" w:color="auto"/>
+              <w:left w:val="single" w:sz="6" w:space="0" w:color="auto"/>
+              <w:bottom w:val="single" w:sz="6" w:space="0" w:color="auto"/>
+              <w:right w:val="single" w:sz="6" w:space="0" w:color="auto"/>
+            </w:tcBorders>
+            <w:tcMar>
+              <w:top w:w="105" w:type="dxa"/>
+              <w:left w:w="150" w:type="dxa"/>
+              <w:bottom w:w="105" w:type="dxa"/>
+              <w:right w:w="150" w:type="dxa"/>
+            </w:tcMar>
+            <w:hideMark/>
+          </w:tcPr>
+          <w:p>
+            <w:pPr>
+              <w:spacing w:after="0" w:line="240" w:lineRule="auto"/>
+              <w:rPr>
+                <w:rFonts w:ascii="Times New Roman" w:eastAsia="Times New Roman" w:hAnsi="Times New Roman" w:cs="Times New Roman"/>
+                <w:sz w:val="20"/>
+                <w:szCs w:val="24"/>
+              </w:rPr>
+            </w:pPr>
+            <w:r>
+              <w:rPr>
+                <w:rFonts w:ascii="Times New Roman" w:eastAsia="Times New Roman" w:hAnsi="Times New Roman" w:cs="Times New Roman"/>
+                <w:sz w:val="20"/>
+                <w:szCs w:val="24"/>
+              </w:rPr>
+              <w:t>Modify</w:t>
+            </w:r>
+          </w:p>
+        </w:tc>
+        <w:tc>
+          <w:tcPr>
+            <w:tcW w:w="5408" w:type="dxa"/>
+            <w:tcBorders>
+              <w:top w:val="single" w:sz="6" w:space="0" w:color="auto"/>
+              <w:left w:val="single" w:sz="6" w:space="0" w:color="auto"/>
+              <w:bottom w:val="single" w:sz="6" w:space="0" w:color="auto"/>
+              <w:right w:val="single" w:sz="6" w:space="0" w:color="auto"/>
+            </w:tcBorders>
+            <w:tcMar>
+              <w:top w:w="105" w:type="dxa"/>
+              <w:left w:w="150" w:type="dxa"/>
+              <w:bottom w:w="105" w:type="dxa"/>
+              <w:right w:w="150" w:type="dxa"/>
+            </w:tcMar>
+            <w:hideMark/>
+          </w:tcPr>
+          <w:p>
+            <w:pPr>
+              <w:spacing w:after="0" w:line="240" w:lineRule="auto"/>
+              <w:rPr>
+                <w:rFonts w:ascii="Times New Roman" w:eastAsia="Times New Roman" w:hAnsi="Times New Roman" w:cs="Times New Roman"/>
+                <w:sz w:val="20"/>
+                <w:szCs w:val="24"/>
+              </w:rPr>
+            </w:pPr>
+            <w:r>
+              <w:rPr>
+                <w:rFonts w:ascii="Times New Roman" w:eastAsia="Times New Roman" w:hAnsi="Times New Roman" w:cs="Times New Roman"/>
+                <w:sz w:val="20"/>
+                <w:szCs w:val="24"/>
+              </w:rPr>
+              <w:t xml:space="preserve">Determines how many session entries </w:t>
+            </w:r>
+            <w:proofErr w:type="spellStart"/>
+            <w:r>
+              <w:rPr>
+                <w:rFonts w:ascii="Times New Roman" w:eastAsia="Times New Roman" w:hAnsi="Times New Roman" w:cs="Times New Roman"/>
+                <w:sz w:val="20"/>
+                <w:szCs w:val="24"/>
+              </w:rPr>
+              <w:t>Arkime</w:t>
+            </w:r>
+            <w:proofErr w:type="spellEnd"/>
+            <w:r>
+              <w:rPr>
+                <w:rFonts w:ascii="Times New Roman" w:eastAsia="Times New Roman" w:hAnsi="Times New Roman" w:cs="Times New Roman"/>
+                <w:sz w:val="20"/>
+                <w:szCs w:val="24"/>
+              </w:rPr>
+              <w:t xml:space="preserve"> queues before performing a bulk insert into the database - Larger values reduce the number of insert operations but increase memory </w:t>
+            </w:r>
+            <w:r>
+              <w:rPr>
+                <w:rFonts w:ascii="Times New Roman" w:eastAsia="Times New Roman" w:hAnsi="Times New Roman" w:cs="Times New Roman"/>
+                <w:sz w:val="20"/>
+                <w:szCs w:val="24"/>
+              </w:rPr>
               <w:lastRenderedPageBreak/>
-              <w:t>"</w:t>
-            </w:r>
-            <w:proofErr w:type="spellStart"/>
-            <w:r>
-              <w:rPr>
-                <w:rFonts w:ascii="Times New Roman" w:eastAsia="Times New Roman" w:hAnsi="Times New Roman" w:cs="Times New Roman"/>
-                <w:b/>
-                <w:bCs/>
-                <w:sz w:val="20"/>
-                <w:szCs w:val="24"/>
-              </w:rPr>
-              <w:t>dbBulkSize</w:t>
-            </w:r>
-            <w:proofErr w:type="spellEnd"/>
-            <w:r>
-              <w:rPr>
-                <w:rFonts w:ascii="Times New Roman" w:eastAsia="Times New Roman" w:hAnsi="Times New Roman" w:cs="Times New Roman"/>
-                <w:b/>
-                <w:bCs/>
-                <w:sz w:val="20"/>
-                <w:szCs w:val="24"/>
-              </w:rPr>
-              <w:t>"</w:t>
-            </w:r>
-          </w:p>
-        </w:tc>
-        <w:tc>
-          <w:tcPr>
-            <w:tcW w:w="1260" w:type="dxa"/>
-            <w:tcBorders>
-              <w:top w:val="single" w:sz="6" w:space="0" w:color="auto"/>
-              <w:left w:val="single" w:sz="6" w:space="0" w:color="auto"/>
-              <w:bottom w:val="single" w:sz="6" w:space="0" w:color="auto"/>
-              <w:right w:val="single" w:sz="6" w:space="0" w:color="auto"/>
-            </w:tcBorders>
-            <w:tcMar>
-              <w:top w:w="105" w:type="dxa"/>
-              <w:left w:w="150" w:type="dxa"/>
-              <w:bottom w:w="105" w:type="dxa"/>
-              <w:right w:w="150" w:type="dxa"/>
-            </w:tcMar>
-            <w:hideMark/>
-          </w:tcPr>
-          <w:p>
-            <w:pPr>
-              <w:spacing w:after="0" w:line="240" w:lineRule="auto"/>
-              <w:rPr>
-                <w:rFonts w:ascii="Times New Roman" w:eastAsia="Times New Roman" w:hAnsi="Times New Roman" w:cs="Times New Roman"/>
-                <w:sz w:val="20"/>
-                <w:szCs w:val="24"/>
-              </w:rPr>
-            </w:pPr>
-            <w:r>
-              <w:rPr>
-                <w:rFonts w:ascii="Times New Roman" w:eastAsia="Times New Roman" w:hAnsi="Times New Roman" w:cs="Times New Roman"/>
-                <w:sz w:val="20"/>
-                <w:szCs w:val="24"/>
-              </w:rPr>
-              <w:t>“150000”</w:t>
-            </w:r>
-          </w:p>
-        </w:tc>
-        <w:tc>
-          <w:tcPr>
-            <w:tcW w:w="1620" w:type="dxa"/>
-            <w:tcBorders>
-              <w:top w:val="single" w:sz="6" w:space="0" w:color="auto"/>
-              <w:left w:val="single" w:sz="6" w:space="0" w:color="auto"/>
-              <w:bottom w:val="single" w:sz="6" w:space="0" w:color="auto"/>
-              <w:right w:val="single" w:sz="6" w:space="0" w:color="auto"/>
-            </w:tcBorders>
-            <w:tcMar>
-              <w:top w:w="105" w:type="dxa"/>
-              <w:left w:w="150" w:type="dxa"/>
-              <w:bottom w:w="105" w:type="dxa"/>
-              <w:right w:w="150" w:type="dxa"/>
-            </w:tcMar>
-            <w:hideMark/>
-          </w:tcPr>
-          <w:p>
-            <w:pPr>
-              <w:spacing w:after="0" w:line="240" w:lineRule="auto"/>
-              <w:rPr>
-                <w:rFonts w:ascii="Times New Roman" w:eastAsia="Times New Roman" w:hAnsi="Times New Roman" w:cs="Times New Roman"/>
-                <w:sz w:val="20"/>
-                <w:szCs w:val="24"/>
-              </w:rPr>
-            </w:pPr>
-            <w:r>
-              <w:rPr>
-                <w:rFonts w:ascii="Times New Roman" w:eastAsia="Times New Roman" w:hAnsi="Times New Roman" w:cs="Times New Roman"/>
-                <w:sz w:val="20"/>
-                <w:szCs w:val="24"/>
-              </w:rPr>
-              <w:t>Modify</w:t>
-            </w:r>
-          </w:p>
-        </w:tc>
-        <w:tc>
-          <w:tcPr>
-            <w:tcW w:w="5408" w:type="dxa"/>
-            <w:tcBorders>
-              <w:top w:val="single" w:sz="6" w:space="0" w:color="auto"/>
-              <w:left w:val="single" w:sz="6" w:space="0" w:color="auto"/>
-              <w:bottom w:val="single" w:sz="6" w:space="0" w:color="auto"/>
-              <w:right w:val="single" w:sz="6" w:space="0" w:color="auto"/>
-            </w:tcBorders>
-            <w:tcMar>
-              <w:top w:w="105" w:type="dxa"/>
-              <w:left w:w="150" w:type="dxa"/>
-              <w:bottom w:w="105" w:type="dxa"/>
-              <w:right w:w="150" w:type="dxa"/>
-            </w:tcMar>
-            <w:hideMark/>
-          </w:tcPr>
-          <w:p>
-            <w:pPr>
-              <w:spacing w:after="0" w:line="240" w:lineRule="auto"/>
-              <w:rPr>
-                <w:rFonts w:ascii="Times New Roman" w:eastAsia="Times New Roman" w:hAnsi="Times New Roman" w:cs="Times New Roman"/>
-                <w:sz w:val="20"/>
-                <w:szCs w:val="24"/>
-              </w:rPr>
-            </w:pPr>
-            <w:r>
-              <w:rPr>
-                <w:rFonts w:ascii="Times New Roman" w:eastAsia="Times New Roman" w:hAnsi="Times New Roman" w:cs="Times New Roman"/>
-                <w:sz w:val="20"/>
-                <w:szCs w:val="24"/>
-              </w:rPr>
-              <w:t xml:space="preserve">Determines how many session entries </w:t>
-            </w:r>
-            <w:proofErr w:type="spellStart"/>
-            <w:r>
-              <w:rPr>
-                <w:rFonts w:ascii="Times New Roman" w:eastAsia="Times New Roman" w:hAnsi="Times New Roman" w:cs="Times New Roman"/>
-                <w:sz w:val="20"/>
-                <w:szCs w:val="24"/>
-              </w:rPr>
-              <w:t>Arkime</w:t>
-            </w:r>
-            <w:proofErr w:type="spellEnd"/>
-            <w:r>
-              <w:rPr>
-                <w:rFonts w:ascii="Times New Roman" w:eastAsia="Times New Roman" w:hAnsi="Times New Roman" w:cs="Times New Roman"/>
-                <w:sz w:val="20"/>
-                <w:szCs w:val="24"/>
-              </w:rPr>
-              <w:t xml:space="preserve"> queues before performing a bulk insert into the database - Larger values reduce the number of insert operations but increase memory usage; smaller values reduce memory footprint but may slow down indexing</w:t>
+              <w:t>usage; smaller values reduce memory footprint but may slow down indexing</w:t>
             </w:r>
           </w:p>
         </w:tc>
@@ -2541,6 +2412,7 @@
                 <w:sz w:val="20"/>
                 <w:szCs w:val="24"/>
               </w:rPr>
+              <w:lastRenderedPageBreak/>
               <w:t>"</w:t>
             </w:r>
             <w:proofErr w:type="spellStart"/>
@@ -3262,25 +3134,7 @@
                 <w:sz w:val="20"/>
                 <w:szCs w:val="24"/>
               </w:rPr>
-              <w:t xml:space="preserve"> identifies the application-layer protocol of a session (e.g., HTTP, DNS, </w:t>
-            </w:r>
-            <w:proofErr w:type="gramStart"/>
-            <w:r>
-              <w:rPr>
-                <w:rFonts w:ascii="Times New Roman" w:eastAsia="Times New Roman" w:hAnsi="Times New Roman" w:cs="Times New Roman"/>
-                <w:sz w:val="20"/>
-                <w:szCs w:val="24"/>
-              </w:rPr>
-              <w:t>TLS</w:t>
-            </w:r>
-            <w:proofErr w:type="gramEnd"/>
-            <w:r>
-              <w:rPr>
-                <w:rFonts w:ascii="Times New Roman" w:eastAsia="Times New Roman" w:hAnsi="Times New Roman" w:cs="Times New Roman"/>
-                <w:sz w:val="20"/>
-                <w:szCs w:val="24"/>
-              </w:rPr>
-              <w:t>).</w:t>
+              <w:t xml:space="preserve"> identifies the application-layer protocol of a session (e.g., HTTP, DNS, TLS).</w:t>
             </w:r>
           </w:p>
         </w:tc>
@@ -4456,28 +4310,7 @@
                 <w:sz w:val="20"/>
                 <w:szCs w:val="24"/>
               </w:rPr>
-              <w:t xml:space="preserve"> compresses HTTP requests to the search backend. When enabled, session and SPI data sent to </w:t>
-            </w:r>
-            <w:proofErr w:type="spellStart"/>
-            <w:r>
-              <w:rPr>
-                <w:rFonts w:ascii="Times New Roman" w:eastAsia="Times New Roman" w:hAnsi="Times New Roman" w:cs="Times New Roman"/>
-                <w:iCs/>
-                <w:sz w:val="20"/>
-                <w:szCs w:val="24"/>
-              </w:rPr>
-              <w:lastRenderedPageBreak/>
-              <w:t>Elasticsearch</w:t>
-            </w:r>
-            <w:proofErr w:type="spellEnd"/>
-            <w:r>
-              <w:rPr>
-                <w:rFonts w:ascii="Times New Roman" w:eastAsia="Times New Roman" w:hAnsi="Times New Roman" w:cs="Times New Roman"/>
-                <w:iCs/>
-                <w:sz w:val="20"/>
-                <w:szCs w:val="24"/>
-              </w:rPr>
-              <w:t xml:space="preserve"> is compressed using </w:t>
+              <w:t xml:space="preserve"> compresses HTTP requests to the search backend. When enabled, session and SPI data sent to Elasticsearch is compressed using </w:t>
             </w:r>
             <w:proofErr w:type="spellStart"/>
             <w:r>
@@ -4541,7 +4374,6 @@
                 <w:sz w:val="20"/>
                 <w:szCs w:val="24"/>
               </w:rPr>
-              <w:lastRenderedPageBreak/>
               <w:t>"</w:t>
             </w:r>
             <w:proofErr w:type="spellStart"/>
@@ -4705,7 +4537,7 @@
     </w:p>
     <w:sectPr>
       <w:pgSz w:w="12240" w:h="15840"/>
-      <w:pgMar w:top="1440" w:right="1440" w:bottom="1440" w:left="1440" w:header="720" w:footer="720" w:gutter="0"/>
+      <w:pgMar w:top="1440" w:right="1440" w:bottom="540" w:left="1440" w:header="720" w:footer="720" w:gutter="0"/>
       <w:cols w:space="720"/>
       <w:docGrid w:linePitch="360"/>
     </w:sectPr>
@@ -4714,7 +4546,7 @@
 </file>
 
 <file path=word/numbering.xml><?xml version="1.0" encoding="utf-8"?>
-<w:numbering xmlns:wpc="http://schemas.microsoft.com/office/word/2010/wordprocessingCanvas" xmlns:cx="http://schemas.microsoft.com/office/drawing/2014/chartex" xmlns:cx1="http://schemas.microsoft.com/office/drawing/2015/9/8/chartex" xmlns:mc="http://schemas.openxmlformats.org/markup-compatibility/2006" xmlns:o="urn:schemas-microsoft-com:office:office" xmlns:r="http://schemas.openxmlformats.org/officeDocument/2006/relationships" xmlns:m="http://schemas.openxmlformats.org/officeDocument/2006/math" xmlns:v="urn:schemas-microsoft-com:vml" xmlns:wp14="http://schemas.microsoft.com/office/word/2010/wordprocessingDrawing" xmlns:wp="http://schemas.openxmlformats.org/drawingml/2006/wordprocessingDrawing" xmlns:w10="urn:schemas-microsoft-com:office:word" xmlns:w="http://schemas.openxmlformats.org/wordprocessingml/2006/main" xmlns:w14="http://schemas.microsoft.com/office/word/2010/wordml" xmlns:w15="http://schemas.microsoft.com/office/word/2012/wordml" xmlns:w16se="http://schemas.microsoft.com/office/word/2015/wordml/symex" xmlns:wpg="http://schemas.microsoft.com/office/word/2010/wordprocessingGroup" xmlns:wpi="http://schemas.microsoft.com/office/word/2010/wordprocessingInk" xmlns:wne="http://schemas.microsoft.com/office/word/2006/wordml" xmlns:wps="http://schemas.microsoft.com/office/word/2010/wordprocessingShape" mc:Ignorable="w14 w15 w16se wp14">
+<w:numbering xmlns:wpc="http://schemas.microsoft.com/office/word/2010/wordprocessingCanvas" xmlns:cx="http://schemas.microsoft.com/office/drawing/2014/chartex" xmlns:cx1="http://schemas.microsoft.com/office/drawing/2015/9/8/chartex" xmlns:cx2="http://schemas.microsoft.com/office/drawing/2015/10/21/chartex" xmlns:cx3="http://schemas.microsoft.com/office/drawing/2016/5/9/chartex" xmlns:cx4="http://schemas.microsoft.com/office/drawing/2016/5/10/chartex" xmlns:cx5="http://schemas.microsoft.com/office/drawing/2016/5/11/chartex" xmlns:cx6="http://schemas.microsoft.com/office/drawing/2016/5/12/chartex" xmlns:cx7="http://schemas.microsoft.com/office/drawing/2016/5/13/chartex" xmlns:cx8="http://schemas.microsoft.com/office/drawing/2016/5/14/chartex" xmlns:mc="http://schemas.openxmlformats.org/markup-compatibility/2006" xmlns:aink="http://schemas.microsoft.com/office/drawing/2016/ink" xmlns:am3d="http://schemas.microsoft.com/office/drawing/2017/model3d" xmlns:o="urn:schemas-microsoft-com:office:office" xmlns:oel="http://schemas.microsoft.com/office/2019/extlst" xmlns:r="http://schemas.openxmlformats.org/officeDocument/2006/relationships" xmlns:m="http://schemas.openxmlformats.org/officeDocument/2006/math" xmlns:v="urn:schemas-microsoft-com:vml" xmlns:wp14="http://schemas.microsoft.com/office/word/2010/wordprocessingDrawing" xmlns:wp="http://schemas.openxmlformats.org/drawingml/2006/wordprocessingDrawing" xmlns:w10="urn:schemas-microsoft-com:office:word" xmlns:w="http://schemas.openxmlformats.org/wordprocessingml/2006/main" xmlns:w14="http://schemas.microsoft.com/office/word/2010/wordml" xmlns:w15="http://schemas.microsoft.com/office/word/2012/wordml" xmlns:w16cex="http://schemas.microsoft.com/office/word/2018/wordml/cex" xmlns:w16cid="http://schemas.microsoft.com/office/word/2016/wordml/cid" xmlns:w16="http://schemas.microsoft.com/office/word/2018/wordml" xmlns:w16du="http://schemas.microsoft.com/office/word/2023/wordml/word16du" xmlns:w16sdtdh="http://schemas.microsoft.com/office/word/2020/wordml/sdtdatahash" xmlns:w16sdtfl="http://schemas.microsoft.com/office/word/2024/wordml/sdtformatlock" xmlns:w16se="http://schemas.microsoft.com/office/word/2015/wordml/symex" xmlns:wpg="http://schemas.microsoft.com/office/word/2010/wordprocessingGroup" xmlns:wpi="http://schemas.microsoft.com/office/word/2010/wordprocessingInk" xmlns:wne="http://schemas.microsoft.com/office/word/2006/wordml" xmlns:wps="http://schemas.microsoft.com/office/word/2010/wordprocessingShape" mc:Ignorable="w14 w15 w16se w16cid w16 w16cex w16sdtdh w16sdtfl w16du wp14">
   <w:abstractNum w:abstractNumId="0" w15:restartNumberingAfterBreak="0">
     <w:nsid w:val="60DA5696"/>
     <w:multiLevelType w:val="multilevel"/>
@@ -4864,14 +4696,14 @@
       </w:rPr>
     </w:lvl>
   </w:abstractNum>
-  <w:num w:numId="1">
+  <w:num w:numId="1" w16cid:durableId="498890160">
     <w:abstractNumId w:val="0"/>
   </w:num>
 </w:numbering>
 </file>
 
 <file path=word/styles.xml><?xml version="1.0" encoding="utf-8"?>
-<w:styles xmlns:mc="http://schemas.openxmlformats.org/markup-compatibility/2006" xmlns:r="http://schemas.openxmlformats.org/officeDocument/2006/relationships" xmlns:w="http://schemas.openxmlformats.org/wordprocessingml/2006/main" xmlns:w14="http://schemas.microsoft.com/office/word/2010/wordml" xmlns:w15="http://schemas.microsoft.com/office/word/2012/wordml" xmlns:w16se="http://schemas.microsoft.com/office/word/2015/wordml/symex" mc:Ignorable="w14 w15 w16se">
+<w:styles xmlns:mc="http://schemas.openxmlformats.org/markup-compatibility/2006" xmlns:r="http://schemas.openxmlformats.org/officeDocument/2006/relationships" xmlns:w="http://schemas.openxmlformats.org/wordprocessingml/2006/main" xmlns:w14="http://schemas.microsoft.com/office/word/2010/wordml" xmlns:w15="http://schemas.microsoft.com/office/word/2012/wordml" xmlns:w16cex="http://schemas.microsoft.com/office/word/2018/wordml/cex" xmlns:w16cid="http://schemas.microsoft.com/office/word/2016/wordml/cid" xmlns:w16="http://schemas.microsoft.com/office/word/2018/wordml" xmlns:w16du="http://schemas.microsoft.com/office/word/2023/wordml/word16du" xmlns:w16sdtdh="http://schemas.microsoft.com/office/word/2020/wordml/sdtdatahash" xmlns:w16sdtfl="http://schemas.microsoft.com/office/word/2024/wordml/sdtformatlock" xmlns:w16se="http://schemas.microsoft.com/office/word/2015/wordml/symex" mc:Ignorable="w14 w15 w16se w16cid w16 w16cex w16sdtdh w16sdtfl w16du">
   <w:docDefaults>
     <w:rPrDefault>
       <w:rPr>
@@ -4887,7 +4719,7 @@
       </w:pPr>
     </w:pPrDefault>
   </w:docDefaults>
-  <w:latentStyles w:defLockedState="0" w:defUIPriority="99" w:defSemiHidden="0" w:defUnhideWhenUsed="0" w:defQFormat="0" w:count="371">
+  <w:latentStyles w:defLockedState="0" w:defUIPriority="99" w:defSemiHidden="0" w:defUnhideWhenUsed="0" w:defQFormat="0" w:count="376">
     <w:lsdException w:name="Normal" w:uiPriority="0" w:qFormat="1"/>
     <w:lsdException w:name="heading 1" w:uiPriority="9" w:qFormat="1"/>
     <w:lsdException w:name="heading 2" w:semiHidden="1" w:uiPriority="9" w:unhideWhenUsed="1" w:qFormat="1"/>
@@ -5259,6 +5091,11 @@
     <w:lsdException w:name="List Table 5 Dark Accent 6" w:uiPriority="50"/>
     <w:lsdException w:name="List Table 6 Colorful Accent 6" w:uiPriority="51"/>
     <w:lsdException w:name="List Table 7 Colorful Accent 6" w:uiPriority="52"/>
+    <w:lsdException w:name="Mention" w:semiHidden="1" w:unhideWhenUsed="1"/>
+    <w:lsdException w:name="Smart Hyperlink" w:semiHidden="1" w:unhideWhenUsed="1"/>
+    <w:lsdException w:name="Hashtag" w:semiHidden="1" w:unhideWhenUsed="1"/>
+    <w:lsdException w:name="Unresolved Mention" w:semiHidden="1" w:unhideWhenUsed="1"/>
+    <w:lsdException w:name="Smart Link" w:semiHidden="1" w:unhideWhenUsed="1"/>
   </w:latentStyles>
   <w:style w:type="paragraph" w:default="1" w:styleId="Normal">
     <w:name w:val="Normal"/>

</xml_diff>